<commit_message>
docx to. pdf for Hegel Course
</commit_message>
<xml_diff>
--- a/content/courses/hegel-2021/pdfs/Week_1_Notes_Mark_2_21-8-31_j.docx
+++ b/content/courses/hegel-2021/pdfs/Week_1_Notes_Mark_2_21-8-31_j.docx
@@ -1,19 +1,13 @@
 
 <file path=word/document.xml><?xml version="1.0" encoding="utf-8"?>
-<w:document xmlns:wpc="http://schemas.microsoft.com/office/word/2010/wordprocessingCanvas" xmlns:cx="http://schemas.microsoft.com/office/drawing/2014/chartex" xmlns:cx1="http://schemas.microsoft.com/office/drawing/2015/9/8/chartex" xmlns:cx2="http://schemas.microsoft.com/office/drawing/2015/10/21/chartex" xmlns:cx3="http://schemas.microsoft.com/office/drawing/2016/5/9/chartex" xmlns:cx4="http://schemas.microsoft.com/office/drawing/2016/5/10/chartex" xmlns:cx5="http://schemas.microsoft.com/office/drawing/2016/5/11/chartex" xmlns:cx6="http://schemas.microsoft.com/office/drawing/2016/5/12/chartex" xmlns:cx7="http://schemas.microsoft.com/office/drawing/2016/5/13/chartex" xmlns:cx8="http://schemas.microsoft.com/office/drawing/2016/5/14/chartex" xmlns:mc="http://schemas.openxmlformats.org/markup-compatibility/2006" xmlns:aink="http://schemas.microsoft.com/office/drawing/2016/ink" xmlns:am3d="http://schemas.microsoft.com/office/drawing/2017/model3d" xmlns:o="urn:schemas-microsoft-com:office:office" xmlns:r="http://schemas.openxmlformats.org/officeDocument/2006/relationships" xmlns:m="http://schemas.openxmlformats.org/officeDocument/2006/math" xmlns:v="urn:schemas-microsoft-com:vml" xmlns:wp14="http://schemas.microsoft.com/office/word/2010/wordprocessingDrawing" xmlns:wp="http://schemas.openxmlformats.org/drawingml/2006/wordprocessingDrawing" xmlns:w10="urn:schemas-microsoft-com:office:word" xmlns:w="http://schemas.openxmlformats.org/wordprocessingml/2006/main" xmlns:w14="http://schemas.microsoft.com/office/word/2010/wordml" xmlns:w15="http://schemas.microsoft.com/office/word/2012/wordml" xmlns:w16cex="http://schemas.microsoft.com/office/word/2018/wordml/cex" xmlns:w16cid="http://schemas.microsoft.com/office/word/2016/wordml/cid" xmlns:w16="http://schemas.microsoft.com/office/word/2018/wordml" xmlns:w16se="http://schemas.microsoft.com/office/word/2015/wordml/symex" xmlns:wpg="http://schemas.microsoft.com/office/word/2010/wordprocessingGroup" xmlns:wpi="http://schemas.microsoft.com/office/word/2010/wordprocessingInk" xmlns:wne="http://schemas.microsoft.com/office/word/2006/wordml" xmlns:wps="http://schemas.microsoft.com/office/word/2010/wordprocessingShape" mc:Ignorable="w14 w15 w16se w16cid w16 w16cex wp14">
+<w:document xmlns:wpc="http://schemas.microsoft.com/office/word/2010/wordprocessingCanvas" xmlns:cx="http://schemas.microsoft.com/office/drawing/2014/chartex" xmlns:cx1="http://schemas.microsoft.com/office/drawing/2015/9/8/chartex" xmlns:cx2="http://schemas.microsoft.com/office/drawing/2015/10/21/chartex" xmlns:cx3="http://schemas.microsoft.com/office/drawing/2016/5/9/chartex" xmlns:cx4="http://schemas.microsoft.com/office/drawing/2016/5/10/chartex" xmlns:cx5="http://schemas.microsoft.com/office/drawing/2016/5/11/chartex" xmlns:cx6="http://schemas.microsoft.com/office/drawing/2016/5/12/chartex" xmlns:cx7="http://schemas.microsoft.com/office/drawing/2016/5/13/chartex" xmlns:cx8="http://schemas.microsoft.com/office/drawing/2016/5/14/chartex" xmlns:mc="http://schemas.openxmlformats.org/markup-compatibility/2006" xmlns:aink="http://schemas.microsoft.com/office/drawing/2016/ink" xmlns:am3d="http://schemas.microsoft.com/office/drawing/2017/model3d" xmlns:o="urn:schemas-microsoft-com:office:office" xmlns:oel="http://schemas.microsoft.com/office/2019/extlst" xmlns:r="http://schemas.openxmlformats.org/officeDocument/2006/relationships" xmlns:m="http://schemas.openxmlformats.org/officeDocument/2006/math" xmlns:v="urn:schemas-microsoft-com:vml" xmlns:wp14="http://schemas.microsoft.com/office/word/2010/wordprocessingDrawing" xmlns:wp="http://schemas.openxmlformats.org/drawingml/2006/wordprocessingDrawing" xmlns:w10="urn:schemas-microsoft-com:office:word" xmlns:w="http://schemas.openxmlformats.org/wordprocessingml/2006/main" xmlns:w14="http://schemas.microsoft.com/office/word/2010/wordml" xmlns:w15="http://schemas.microsoft.com/office/word/2012/wordml" xmlns:w16cex="http://schemas.microsoft.com/office/word/2018/wordml/cex" xmlns:w16cid="http://schemas.microsoft.com/office/word/2016/wordml/cid" xmlns:w16="http://schemas.microsoft.com/office/word/2018/wordml" xmlns:w16du="http://schemas.microsoft.com/office/word/2023/wordml/word16du" xmlns:w16sdtdh="http://schemas.microsoft.com/office/word/2020/wordml/sdtdatahash" xmlns:w16sdtfl="http://schemas.microsoft.com/office/word/2024/wordml/sdtformatlock" xmlns:w16se="http://schemas.microsoft.com/office/word/2015/wordml/symex" xmlns:wpg="http://schemas.microsoft.com/office/word/2010/wordprocessingGroup" xmlns:wpi="http://schemas.microsoft.com/office/word/2010/wordprocessingInk" xmlns:wne="http://schemas.microsoft.com/office/word/2006/wordml" xmlns:wps="http://schemas.microsoft.com/office/word/2010/wordprocessingShape" mc:Ignorable="w14 w15 w16se w16cid w16 w16cex w16sdtdh w16sdtfl w16du wp14">
   <w:body>
     <w:p>
       <w:pPr>
         <w:jc w:val="right"/>
       </w:pPr>
       <w:r>
-        <w:t xml:space="preserve">August </w:t>
-      </w:r>
-      <w:r>
-        <w:t>31</w:t>
-      </w:r>
-      <w:r>
-        <w:t>, 2021</w:t>
+        <w:t>August 31, 2021</w:t>
       </w:r>
     </w:p>
     <w:p>
@@ -100,39 +94,16 @@
           <w:rFonts w:cs="Times New Roman"/>
           <w:szCs w:val="24"/>
         </w:rPr>
-        <w:t>Maybe also book cover</w:t>
-      </w:r>
-      <w:r>
-        <w:rPr>
-          <w:rFonts w:cs="Times New Roman"/>
-          <w:szCs w:val="24"/>
-        </w:rPr>
-        <w:t xml:space="preserve"> (for mood)</w:t>
-      </w:r>
-      <w:r>
-        <w:rPr>
-          <w:rFonts w:cs="Times New Roman"/>
-          <w:szCs w:val="24"/>
-        </w:rPr>
-        <w:t xml:space="preserve">: </w:t>
-      </w:r>
-      <w:r>
-        <w:rPr>
-          <w:rFonts w:cs="Times New Roman"/>
-          <w:i/>
-          <w:iCs/>
-          <w:szCs w:val="24"/>
-        </w:rPr>
-        <w:t xml:space="preserve">Doestoevsky Reads Hegel in Siberia and </w:t>
-      </w:r>
-      <w:r>
-        <w:rPr>
-          <w:rFonts w:cs="Times New Roman"/>
-          <w:i/>
-          <w:iCs/>
-          <w:szCs w:val="24"/>
-        </w:rPr>
-        <w:t>Bursts Into Tears</w:t>
+        <w:t xml:space="preserve">Maybe also book cover (for mood): </w:t>
+      </w:r>
+      <w:r>
+        <w:rPr>
+          <w:rFonts w:cs="Times New Roman"/>
+          <w:i/>
+          <w:iCs/>
+          <w:szCs w:val="24"/>
+        </w:rPr>
+        <w:t>Doestoevsky Reads Hegel in Siberia and Bursts Into Tears</w:t>
       </w:r>
       <w:r>
         <w:rPr>
@@ -333,21 +304,7 @@
           <w:rFonts w:cs="Times New Roman"/>
           <w:szCs w:val="24"/>
         </w:rPr>
-        <w:t>He is, for us philosophers, what the poet Algernon Swinburne said the sea</w:t>
-      </w:r>
-      <w:r>
-        <w:rPr>
-          <w:rFonts w:cs="Times New Roman"/>
-          <w:szCs w:val="24"/>
-        </w:rPr>
-        <w:t xml:space="preserve"> is</w:t>
-      </w:r>
-      <w:r>
-        <w:rPr>
-          <w:rFonts w:cs="Times New Roman"/>
-          <w:szCs w:val="24"/>
-        </w:rPr>
-        <w:t>: “The great, grey, mother of us all.”</w:t>
+        <w:t>He is, for us philosophers, what the poet Algernon Swinburne said the sea is: “The great, grey, mother of us all.”</w:t>
       </w:r>
     </w:p>
     <w:p>
@@ -1876,13 +1833,7 @@
     </w:p>
     <w:p>
       <w:r>
-        <w:t>Rickert (Heidegger</w:t>
-      </w:r>
-      <w:r>
-        <w:t>’s Doktorvater</w:t>
-      </w:r>
-      <w:r>
-        <w:t xml:space="preserve">) also Doktorvater of Bruno Bauch (Jena: Frege’s colleague and Carnap’s </w:t>
+        <w:t xml:space="preserve">Rickert (Heidegger’s Doktorvater) also Doktorvater of Bruno Bauch (Jena: Frege’s colleague and Carnap’s </w:t>
       </w:r>
       <w:r>
         <w:rPr>
@@ -1949,26 +1900,16 @@
         <w:t>quid juris</w:t>
       </w:r>
       <w:r>
-        <w:t>, as the “celebrated Mr. Locke,” who produced a “mere physiology of the Understanding” did not.</w:t>
-      </w:r>
-      <w:r>
-        <w:t xml:space="preserve">  </w:t>
-      </w:r>
-    </w:p>
-    <w:p>
-      <w:r>
-        <w:rPr>
-          <w:b/>
-          <w:bCs/>
-        </w:rPr>
-        <w:t>Kant</w:t>
-      </w:r>
-      <w:r>
-        <w:rPr>
-          <w:b/>
-          <w:bCs/>
-        </w:rPr>
-        <w:t xml:space="preserve"> “depsychologized epistemology</w:t>
+        <w:t xml:space="preserve">, as the “celebrated Mr. Locke,” who produced a “mere physiology of the Understanding” did not.  </w:t>
+      </w:r>
+    </w:p>
+    <w:p>
+      <w:r>
+        <w:rPr>
+          <w:b/>
+          <w:bCs/>
+        </w:rPr>
+        <w:t>Kant “depsychologized epistemology</w:t>
       </w:r>
       <w:r>
         <w:t>” by seeing it as a normative discipline.</w:t>
@@ -1977,10 +1918,7 @@
     <w:p/>
     <w:p>
       <w:r>
-        <w:t xml:space="preserve">Cavell: </w:t>
-      </w:r>
-      <w:r>
-        <w:t xml:space="preserve">then </w:t>
+        <w:t xml:space="preserve">Cavell: then </w:t>
       </w:r>
       <w:r>
         <w:rPr>
@@ -2018,13 +1956,7 @@
     <w:p/>
     <w:p>
       <w:r>
-        <w:t xml:space="preserve">Beiser argues </w:t>
-      </w:r>
-      <w:r>
-        <w:t xml:space="preserve">persuasively </w:t>
-      </w:r>
-      <w:r>
-        <w:t xml:space="preserve">that the neoKantians never overcame the </w:t>
+        <w:t xml:space="preserve">Beiser argues persuasively that the neoKantians never overcame the </w:t>
       </w:r>
       <w:r>
         <w:rPr>
@@ -2040,10 +1972,7 @@
     <w:p/>
     <w:p>
       <w:r>
-        <w:t>Neokantian t</w:t>
-      </w:r>
-      <w:r>
-        <w:t xml:space="preserve">radition oscillated between </w:t>
+        <w:t xml:space="preserve">Neokantian tradition oscillated between </w:t>
       </w:r>
     </w:p>
     <w:p>
@@ -2121,13 +2050,7 @@
     <w:p/>
     <w:p>
       <w:r>
-        <w:t xml:space="preserve">But </w:t>
-      </w:r>
-      <w:r>
-        <w:t>neokantians</w:t>
-      </w:r>
-      <w:r>
-        <w:t xml:space="preserve"> </w:t>
+        <w:t xml:space="preserve">But neokantians </w:t>
       </w:r>
       <w:r>
         <w:rPr>
@@ -2342,13 +2265,7 @@
         <w:t>this</w:t>
       </w:r>
       <w:r>
-        <w:t xml:space="preserve"> retrospectively constituted tradition</w:t>
-      </w:r>
-      <w:r>
-        <w:t>—all the way to later Wittgenstein</w:t>
-      </w:r>
-      <w:r>
-        <w:t>.</w:t>
+        <w:t xml:space="preserve"> retrospectively constituted tradition—all the way to later Wittgenstein.</w:t>
       </w:r>
     </w:p>
     <w:p>
@@ -2657,10 +2574,7 @@
         </w:rPr>
       </w:pPr>
       <w:r>
-        <w:t>Self-consciousness</w:t>
-      </w:r>
-      <w:r>
-        <w:t xml:space="preserve"> is a </w:t>
+        <w:t xml:space="preserve">Self-consciousness is a </w:t>
       </w:r>
       <w:r>
         <w:rPr>
@@ -3223,13 +3137,7 @@
         <w:spacing w:line="276" w:lineRule="auto"/>
       </w:pPr>
       <w:r>
-        <w:t>As a result</w:t>
-      </w:r>
-      <w:r>
-        <w:t xml:space="preserve"> (to repeat):</w:t>
-      </w:r>
-      <w:r>
-        <w:t xml:space="preserve"> </w:t>
+        <w:t xml:space="preserve">As a result (to repeat): </w:t>
       </w:r>
     </w:p>
     <w:p>
@@ -3900,35 +3808,7 @@
           <w:rFonts w:cs="Times New Roman"/>
           <w:szCs w:val="24"/>
         </w:rPr>
-        <w:t>?  Kierkegaard and Marx and Nietzsche do.  Husserl and Heidegger, Foucault and Derrida do.  Frege and Russell, Carnap and Quine do not.  For them at most the rise of modern science matters, not its deep connection to political liberalism</w:t>
-      </w:r>
-      <w:r>
-        <w:rPr>
-          <w:rFonts w:cs="Times New Roman"/>
-          <w:szCs w:val="24"/>
-        </w:rPr>
-        <w:t>, economic capitalism,</w:t>
-      </w:r>
-      <w:r>
-        <w:rPr>
-          <w:rFonts w:cs="Times New Roman"/>
-          <w:szCs w:val="24"/>
-        </w:rPr>
-        <w:t xml:space="preserve"> and the </w:t>
-      </w:r>
-      <w:r>
-        <w:rPr>
-          <w:rFonts w:cs="Times New Roman"/>
-          <w:szCs w:val="24"/>
-        </w:rPr>
-        <w:t xml:space="preserve">literary </w:t>
-      </w:r>
-      <w:r>
-        <w:rPr>
-          <w:rFonts w:cs="Times New Roman"/>
-          <w:szCs w:val="24"/>
-        </w:rPr>
-        <w:t xml:space="preserve">rise of the novel.  </w:t>
+        <w:t xml:space="preserve">?  Kierkegaard and Marx and Nietzsche do.  Husserl and Heidegger, Foucault and Derrida do.  Frege and Russell, Carnap and Quine do not.  For them at most the rise of modern science matters, not its deep connection to political liberalism, economic capitalism, and the literary rise of the novel.  </w:t>
       </w:r>
     </w:p>
     <w:p>
@@ -4062,21 +3942,7 @@
           <w:rFonts w:cs="Times New Roman"/>
           <w:szCs w:val="24"/>
         </w:rPr>
-        <w:t>:  How may we read Hegel</w:t>
-      </w:r>
-      <w:r>
-        <w:rPr>
-          <w:rFonts w:cs="Times New Roman"/>
-          <w:szCs w:val="24"/>
-        </w:rPr>
-        <w:t xml:space="preserve"> now</w:t>
-      </w:r>
-      <w:r>
-        <w:rPr>
-          <w:rFonts w:cs="Times New Roman"/>
-          <w:szCs w:val="24"/>
-        </w:rPr>
-        <w:t>?</w:t>
+        <w:t>:  How may we read Hegel now?</w:t>
       </w:r>
     </w:p>
     <w:p>
@@ -4160,19 +4026,7 @@
         <w:rPr>
           <w:rFonts w:eastAsia="Times New Roman"/>
         </w:rPr>
-        <w:t xml:space="preserve"> once said he that he often found h</w:t>
-      </w:r>
-      <w:r>
-        <w:rPr>
-          <w:rFonts w:eastAsia="Times New Roman"/>
-        </w:rPr>
-        <w:t>i</w:t>
-      </w:r>
-      <w:r>
-        <w:rPr>
-          <w:rFonts w:eastAsia="Times New Roman"/>
-        </w:rPr>
-        <w:t xml:space="preserve">mself addressing analytic audiences who, he came to realize, when he mentioned hermeneutics thought he was referring to a German philosopher whose </w:t>
+        <w:t xml:space="preserve"> once said he that he often found himself addressing analytic audiences who, he came to realize, when he mentioned hermeneutics thought he was referring to a German philosopher whose </w:t>
       </w:r>
       <w:r>
         <w:rPr>
@@ -5898,33 +5752,21 @@
           <w:rFonts w:eastAsia="Times New Roman" w:cs="Times New Roman"/>
         </w:rPr>
         <w:br/>
-        <w:t>A: As inferential roles</w:t>
+        <w:t xml:space="preserve">A: As inferential roles (or at least as </w:t>
       </w:r>
       <w:r>
         <w:rPr>
           <w:rFonts w:eastAsia="Times New Roman" w:cs="Times New Roman"/>
-        </w:rPr>
-        <w:t xml:space="preserve"> (or at least as </w:t>
+          <w:i/>
+          <w:iCs/>
+        </w:rPr>
+        <w:t>determining</w:t>
       </w:r>
       <w:r>
         <w:rPr>
           <w:rFonts w:eastAsia="Times New Roman" w:cs="Times New Roman"/>
-          <w:i/>
-          <w:iCs/>
-        </w:rPr>
-        <w:t>determining</w:t>
-      </w:r>
-      <w:r>
-        <w:rPr>
-          <w:rFonts w:eastAsia="Times New Roman" w:cs="Times New Roman"/>
-        </w:rPr>
-        <w:t xml:space="preserve"> inferential roles)</w:t>
-      </w:r>
-      <w:r>
-        <w:rPr>
-          <w:rFonts w:eastAsia="Times New Roman" w:cs="Times New Roman"/>
-        </w:rPr>
-        <w:t>.</w:t>
+        </w:rPr>
+        <w:t xml:space="preserve"> inferential roles).</w:t>
       </w:r>
     </w:p>
     <w:p>
@@ -7134,19 +6976,7 @@
         <w:rPr>
           <w:rFonts w:cs="Times New Roman"/>
         </w:rPr>
-        <w:t xml:space="preserve"> claims one combines with it, as a context of collateral premises or auxiliary hypotheses.  It depends</w:t>
-      </w:r>
-      <w:r>
-        <w:rPr>
-          <w:rFonts w:cs="Times New Roman"/>
-        </w:rPr>
-        <w:t>, in other words,</w:t>
-      </w:r>
-      <w:r>
-        <w:rPr>
-          <w:rFonts w:cs="Times New Roman"/>
-        </w:rPr>
-        <w:t xml:space="preserve"> on what </w:t>
+        <w:t xml:space="preserve"> claims one combines with it, as a context of collateral premises or auxiliary hypotheses.  It depends, in other words, on what </w:t>
       </w:r>
       <w:r>
         <w:rPr>
@@ -7160,13 +6990,7 @@
         <w:rPr>
           <w:rFonts w:cs="Times New Roman"/>
         </w:rPr>
-        <w:t xml:space="preserve"> one takes to be true.</w:t>
-      </w:r>
-      <w:r>
-        <w:rPr>
-          <w:rFonts w:cs="Times New Roman"/>
-        </w:rPr>
-        <w:t xml:space="preserve">  </w:t>
+        <w:t xml:space="preserve"> one takes to be true.  </w:t>
       </w:r>
     </w:p>
     <w:p>
@@ -7257,13 +7081,7 @@
         <w:rPr>
           <w:rFonts w:cs="Times New Roman"/>
         </w:rPr>
-        <w:t xml:space="preserve"> perspective on the meaning.  For each provides an argument, so to speak, for the semantic function associated with a sentence that, supplied with a context, computes an inferential role, in the sense of a set of consequences, and a determination of what would be a reason for or against the claimable in that context.  Some of these contexts might be of more pragmatic interest than others</w:t>
-      </w:r>
-      <w:r>
-        <w:rPr>
-          <w:rFonts w:cs="Times New Roman"/>
-        </w:rPr>
-        <w:t xml:space="preserve"> (for instance, the </w:t>
+        <w:t xml:space="preserve"> perspective on the meaning.  For each provides an argument, so to speak, for the semantic function associated with a sentence that, supplied with a context, computes an inferential role, in the sense of a set of consequences, and a determination of what would be a reason for or against the claimable in that context.  Some of these contexts might be of more pragmatic interest than others (for instance, the </w:t>
       </w:r>
       <w:r>
         <w:rPr>
@@ -7277,13 +7095,7 @@
         <w:rPr>
           <w:rFonts w:cs="Times New Roman"/>
         </w:rPr>
-        <w:t>readings that result from conjoining other claims the author actually makes or would have endorsed)</w:t>
-      </w:r>
-      <w:r>
-        <w:rPr>
-          <w:rFonts w:cs="Times New Roman"/>
-        </w:rPr>
-        <w:t xml:space="preserve">, but each is </w:t>
+        <w:t xml:space="preserve">readings that result from conjoining other claims the author actually makes or would have endorsed), but each is </w:t>
       </w:r>
       <w:r>
         <w:rPr>
@@ -7329,13 +7141,7 @@
         <w:rPr>
           <w:rFonts w:cs="Times New Roman"/>
         </w:rPr>
-        <w:t xml:space="preserve">But </w:t>
-      </w:r>
-      <w:r>
-        <w:rPr>
-          <w:rFonts w:cs="Times New Roman"/>
-        </w:rPr>
-        <w:t xml:space="preserve">it might seem that this last, irenic perspectivalist claim is going too far.  </w:t>
+        <w:t xml:space="preserve">But it might seem that this last, irenic perspectivalist claim is going too far.  </w:t>
       </w:r>
       <w:r>
         <w:rPr>
@@ -7476,13 +7282,7 @@
         <w:rPr>
           <w:rFonts w:cs="Times New Roman"/>
         </w:rPr>
-        <w:t>true.</w:t>
-      </w:r>
-      <w:r>
-        <w:rPr>
-          <w:rFonts w:cs="Times New Roman"/>
-        </w:rPr>
-        <w:t xml:space="preserve">  </w:t>
+        <w:t xml:space="preserve">true.  </w:t>
       </w:r>
     </w:p>
     <w:p>
@@ -7551,19 +7351,7 @@
         <w:rPr>
           <w:rFonts w:cs="Times New Roman"/>
         </w:rPr>
-        <w:t xml:space="preserve"> might think follows from or is evidence for or against them</w:t>
-      </w:r>
-      <w:r>
-        <w:rPr>
-          <w:rFonts w:cs="Times New Roman"/>
-        </w:rPr>
-        <w:t xml:space="preserve">, </w:t>
-      </w:r>
-      <w:r>
-        <w:rPr>
-          <w:rFonts w:cs="Times New Roman"/>
-        </w:rPr>
-        <w:t xml:space="preserve">combine the claim exclusively with </w:t>
+        <w:t xml:space="preserve"> might think follows from or is evidence for or against them, combine the claim exclusively with </w:t>
       </w:r>
       <w:r>
         <w:rPr>
@@ -8188,11 +7976,6 @@
           <w:rFonts w:cs="Times New Roman"/>
         </w:rPr>
         <w:tab/>
-      </w:r>
-      <w:r>
-        <w:rPr>
-          <w:rFonts w:cs="Times New Roman"/>
-        </w:rPr>
         <w:t>What I call “</w:t>
       </w:r>
       <w:r>
@@ -8223,19 +8006,7 @@
         <w:rPr>
           <w:rFonts w:cs="Times New Roman"/>
         </w:rPr>
-        <w:t xml:space="preserve"> </w:t>
-      </w:r>
-      <w:r>
-        <w:rPr>
-          <w:rFonts w:cs="Times New Roman"/>
-        </w:rPr>
-        <w:t xml:space="preserve">is another alternative, and </w:t>
-      </w:r>
-      <w:r>
-        <w:rPr>
-          <w:rFonts w:cs="Times New Roman"/>
-        </w:rPr>
-        <w:t xml:space="preserve">uses collateral premises drawn from a tradition encompassing the author or text in question.  But it allows using </w:t>
+        <w:t xml:space="preserve"> is another alternative, and uses collateral premises drawn from a tradition encompassing the author or text in question.  But it allows using </w:t>
       </w:r>
       <w:r>
         <w:rPr>
@@ -8718,10 +8489,7 @@
         </w:numPr>
       </w:pPr>
       <w:r>
-        <w:t xml:space="preserve"> </w:t>
-      </w:r>
-      <w:r>
-        <w:t xml:space="preserve">Will not be even-handed between </w:t>
+        <w:t xml:space="preserve"> Will not be even-handed between </w:t>
       </w:r>
       <w:r>
         <w:rPr>
@@ -8849,21 +8617,7 @@
           <w:rFonts w:cs="Times New Roman"/>
           <w:szCs w:val="24"/>
         </w:rPr>
-        <w:t>Add Carl</w:t>
-      </w:r>
-      <w:r>
-        <w:rPr>
-          <w:rFonts w:cs="Times New Roman"/>
-          <w:szCs w:val="24"/>
-        </w:rPr>
-        <w:t xml:space="preserve"> Sachs</w:t>
-      </w:r>
-      <w:r>
-        <w:rPr>
-          <w:rFonts w:cs="Times New Roman"/>
-          <w:szCs w:val="24"/>
-        </w:rPr>
-        <w:t>’s “</w:t>
+        <w:t>Add Carl Sachs’s “</w:t>
       </w:r>
       <w:r>
         <w:rPr>
@@ -8945,10 +8699,7 @@
         </w:numPr>
       </w:pPr>
       <w:r>
-        <w:t xml:space="preserve"> </w:t>
-      </w:r>
-      <w:r>
-        <w:t xml:space="preserve">For </w:t>
+        <w:t xml:space="preserve"> For </w:t>
       </w:r>
       <w:r>
         <w:rPr>
@@ -8970,13 +8721,7 @@
         </w:numPr>
       </w:pPr>
       <w:r>
-        <w:t>Which translation?</w:t>
-      </w:r>
-      <w:r>
-        <w:t xml:space="preserve"> </w:t>
-      </w:r>
-      <w:r>
-        <w:t xml:space="preserve">A: Michael Inwood or Miller.  (Will use Miller paragraph numbering, which Inwood includes.)  </w:t>
+        <w:t xml:space="preserve">Which translation? A: Michael Inwood or Miller.  (Will use Miller paragraph numbering, which Inwood includes.)  </w:t>
       </w:r>
     </w:p>
     <w:p>
@@ -8988,10 +8733,7 @@
         </w:numPr>
       </w:pPr>
       <w:r>
-        <w:t>Which other works?  Hyppolite</w:t>
-      </w:r>
-      <w:r>
-        <w:t xml:space="preserve"> (</w:t>
+        <w:t>Which other works?  Hyppolite (</w:t>
       </w:r>
       <w:r>
         <w:rPr>
@@ -9001,13 +8743,7 @@
         <w:t>Genesis and Structure of Hegel’s Phenomenology of Spirit</w:t>
       </w:r>
       <w:r>
-        <w:t>)</w:t>
-      </w:r>
-      <w:r>
-        <w:t>, Pinkard</w:t>
-      </w:r>
-      <w:r>
-        <w:t xml:space="preserve"> (</w:t>
+        <w:t>), Pinkard (</w:t>
       </w:r>
       <w:r>
         <w:rPr>
@@ -9017,13 +8753,7 @@
         <w:t>Hegel’s Phenomenology: The Sociality of Reason</w:t>
       </w:r>
       <w:r>
-        <w:t>)</w:t>
-      </w:r>
-      <w:r>
-        <w:t>, Kojeve</w:t>
-      </w:r>
-      <w:r>
-        <w:t xml:space="preserve"> (</w:t>
+        <w:t>), Kojeve (</w:t>
       </w:r>
       <w:r>
         <w:rPr>
@@ -9033,10 +8763,7 @@
         <w:t>Introduction to the Reading of Hegel</w:t>
       </w:r>
       <w:r>
-        <w:t>)</w:t>
-      </w:r>
-      <w:r>
-        <w:t>.</w:t>
+        <w:t>).</w:t>
       </w:r>
     </w:p>
     <w:p>
@@ -9048,10 +8775,7 @@
         </w:numPr>
       </w:pPr>
       <w:r>
-        <w:t>On Hegel’s life: Pinkard</w:t>
-      </w:r>
-      <w:r>
-        <w:t xml:space="preserve"> (</w:t>
+        <w:t>On Hegel’s life: Pinkard (</w:t>
       </w:r>
       <w:r>
         <w:rPr>
@@ -9190,14 +8914,7 @@
           <w:rFonts w:cs="Times New Roman"/>
           <w:szCs w:val="24"/>
         </w:rPr>
-        <w:t xml:space="preserve">Humboldt lectures: </w:t>
-      </w:r>
-      <w:r>
-        <w:rPr>
-          <w:rFonts w:cs="Times New Roman"/>
-          <w:szCs w:val="24"/>
-        </w:rPr>
-        <w:t xml:space="preserve">video, and </w:t>
+        <w:t xml:space="preserve">Humboldt lectures: video, and </w:t>
       </w:r>
     </w:p>
     <w:p>
@@ -9221,14 +8938,7 @@
           <w:rFonts w:cs="Times New Roman"/>
           <w:szCs w:val="24"/>
         </w:rPr>
-        <w:t xml:space="preserve">Humboldt lectures: </w:t>
-      </w:r>
-      <w:r>
-        <w:rPr>
-          <w:rFonts w:cs="Times New Roman"/>
-          <w:szCs w:val="24"/>
-        </w:rPr>
-        <w:t>(maximally concentrated) handouts.</w:t>
+        <w:t>Humboldt lectures: (maximally concentrated) handouts.</w:t>
       </w:r>
     </w:p>
     <w:p>
@@ -9344,14 +9054,7 @@
           <w:rFonts w:cs="Times New Roman"/>
           <w:szCs w:val="24"/>
         </w:rPr>
-        <w:t>.  So, only 6 years after Hegel’s death</w:t>
-      </w:r>
-      <w:r>
-        <w:rPr>
-          <w:rFonts w:cs="Times New Roman"/>
-          <w:szCs w:val="24"/>
-        </w:rPr>
-        <w:t xml:space="preserve">, only 30 after </w:t>
+        <w:t xml:space="preserve">.  So, only 6 years after Hegel’s death, only 30 after </w:t>
       </w:r>
       <w:r>
         <w:rPr>
@@ -9450,6 +9153,7 @@
         </w:rPr>
       </w:pPr>
     </w:p>
+    <w:p/>
     <w:sectPr>
       <w:footerReference w:type="default" r:id="rId7"/>
       <w:pgSz w:w="12240" w:h="15840"/>
@@ -9462,7 +9166,7 @@
 </file>
 
 <file path=word/endnotes.xml><?xml version="1.0" encoding="utf-8"?>
-<w:endnotes xmlns:wpc="http://schemas.microsoft.com/office/word/2010/wordprocessingCanvas" xmlns:cx="http://schemas.microsoft.com/office/drawing/2014/chartex" xmlns:cx1="http://schemas.microsoft.com/office/drawing/2015/9/8/chartex" xmlns:cx2="http://schemas.microsoft.com/office/drawing/2015/10/21/chartex" xmlns:cx3="http://schemas.microsoft.com/office/drawing/2016/5/9/chartex" xmlns:cx4="http://schemas.microsoft.com/office/drawing/2016/5/10/chartex" xmlns:cx5="http://schemas.microsoft.com/office/drawing/2016/5/11/chartex" xmlns:cx6="http://schemas.microsoft.com/office/drawing/2016/5/12/chartex" xmlns:cx7="http://schemas.microsoft.com/office/drawing/2016/5/13/chartex" xmlns:cx8="http://schemas.microsoft.com/office/drawing/2016/5/14/chartex" xmlns:mc="http://schemas.openxmlformats.org/markup-compatibility/2006" xmlns:aink="http://schemas.microsoft.com/office/drawing/2016/ink" xmlns:am3d="http://schemas.microsoft.com/office/drawing/2017/model3d" xmlns:o="urn:schemas-microsoft-com:office:office" xmlns:r="http://schemas.openxmlformats.org/officeDocument/2006/relationships" xmlns:m="http://schemas.openxmlformats.org/officeDocument/2006/math" xmlns:v="urn:schemas-microsoft-com:vml" xmlns:wp14="http://schemas.microsoft.com/office/word/2010/wordprocessingDrawing" xmlns:wp="http://schemas.openxmlformats.org/drawingml/2006/wordprocessingDrawing" xmlns:w10="urn:schemas-microsoft-com:office:word" xmlns:w="http://schemas.openxmlformats.org/wordprocessingml/2006/main" xmlns:w14="http://schemas.microsoft.com/office/word/2010/wordml" xmlns:w15="http://schemas.microsoft.com/office/word/2012/wordml" xmlns:w16cex="http://schemas.microsoft.com/office/word/2018/wordml/cex" xmlns:w16cid="http://schemas.microsoft.com/office/word/2016/wordml/cid" xmlns:w16="http://schemas.microsoft.com/office/word/2018/wordml" xmlns:w16se="http://schemas.microsoft.com/office/word/2015/wordml/symex" xmlns:wpg="http://schemas.microsoft.com/office/word/2010/wordprocessingGroup" xmlns:wpi="http://schemas.microsoft.com/office/word/2010/wordprocessingInk" xmlns:wne="http://schemas.microsoft.com/office/word/2006/wordml" xmlns:wps="http://schemas.microsoft.com/office/word/2010/wordprocessingShape" mc:Ignorable="w14 w15 w16se w16cid w16 w16cex wp14">
+<w:endnotes xmlns:wpc="http://schemas.microsoft.com/office/word/2010/wordprocessingCanvas" xmlns:cx="http://schemas.microsoft.com/office/drawing/2014/chartex" xmlns:cx1="http://schemas.microsoft.com/office/drawing/2015/9/8/chartex" xmlns:cx2="http://schemas.microsoft.com/office/drawing/2015/10/21/chartex" xmlns:cx3="http://schemas.microsoft.com/office/drawing/2016/5/9/chartex" xmlns:cx4="http://schemas.microsoft.com/office/drawing/2016/5/10/chartex" xmlns:cx5="http://schemas.microsoft.com/office/drawing/2016/5/11/chartex" xmlns:cx6="http://schemas.microsoft.com/office/drawing/2016/5/12/chartex" xmlns:cx7="http://schemas.microsoft.com/office/drawing/2016/5/13/chartex" xmlns:cx8="http://schemas.microsoft.com/office/drawing/2016/5/14/chartex" xmlns:mc="http://schemas.openxmlformats.org/markup-compatibility/2006" xmlns:aink="http://schemas.microsoft.com/office/drawing/2016/ink" xmlns:am3d="http://schemas.microsoft.com/office/drawing/2017/model3d" xmlns:o="urn:schemas-microsoft-com:office:office" xmlns:oel="http://schemas.microsoft.com/office/2019/extlst" xmlns:r="http://schemas.openxmlformats.org/officeDocument/2006/relationships" xmlns:m="http://schemas.openxmlformats.org/officeDocument/2006/math" xmlns:v="urn:schemas-microsoft-com:vml" xmlns:wp14="http://schemas.microsoft.com/office/word/2010/wordprocessingDrawing" xmlns:wp="http://schemas.openxmlformats.org/drawingml/2006/wordprocessingDrawing" xmlns:w10="urn:schemas-microsoft-com:office:word" xmlns:w="http://schemas.openxmlformats.org/wordprocessingml/2006/main" xmlns:w14="http://schemas.microsoft.com/office/word/2010/wordml" xmlns:w15="http://schemas.microsoft.com/office/word/2012/wordml" xmlns:w16cex="http://schemas.microsoft.com/office/word/2018/wordml/cex" xmlns:w16cid="http://schemas.microsoft.com/office/word/2016/wordml/cid" xmlns:w16="http://schemas.microsoft.com/office/word/2018/wordml" xmlns:w16du="http://schemas.microsoft.com/office/word/2023/wordml/word16du" xmlns:w16sdtdh="http://schemas.microsoft.com/office/word/2020/wordml/sdtdatahash" xmlns:w16sdtfl="http://schemas.microsoft.com/office/word/2024/wordml/sdtformatlock" xmlns:w16se="http://schemas.microsoft.com/office/word/2015/wordml/symex" xmlns:wpg="http://schemas.microsoft.com/office/word/2010/wordprocessingGroup" xmlns:wpi="http://schemas.microsoft.com/office/word/2010/wordprocessingInk" xmlns:wne="http://schemas.microsoft.com/office/word/2006/wordml" xmlns:wps="http://schemas.microsoft.com/office/word/2010/wordprocessingShape" mc:Ignorable="w14 w15 w16se w16cid w16 w16cex w16sdtdh w16sdtfl w16du wp14">
   <w:endnote w:type="separator" w:id="-1">
     <w:p>
       <w:pPr>
@@ -9487,7 +9191,7 @@
 </file>
 
 <file path=word/footer1.xml><?xml version="1.0" encoding="utf-8"?>
-<w:ftr xmlns:wpc="http://schemas.microsoft.com/office/word/2010/wordprocessingCanvas" xmlns:cx="http://schemas.microsoft.com/office/drawing/2014/chartex" xmlns:cx1="http://schemas.microsoft.com/office/drawing/2015/9/8/chartex" xmlns:cx2="http://schemas.microsoft.com/office/drawing/2015/10/21/chartex" xmlns:cx3="http://schemas.microsoft.com/office/drawing/2016/5/9/chartex" xmlns:cx4="http://schemas.microsoft.com/office/drawing/2016/5/10/chartex" xmlns:cx5="http://schemas.microsoft.com/office/drawing/2016/5/11/chartex" xmlns:cx6="http://schemas.microsoft.com/office/drawing/2016/5/12/chartex" xmlns:cx7="http://schemas.microsoft.com/office/drawing/2016/5/13/chartex" xmlns:cx8="http://schemas.microsoft.com/office/drawing/2016/5/14/chartex" xmlns:mc="http://schemas.openxmlformats.org/markup-compatibility/2006" xmlns:aink="http://schemas.microsoft.com/office/drawing/2016/ink" xmlns:am3d="http://schemas.microsoft.com/office/drawing/2017/model3d" xmlns:o="urn:schemas-microsoft-com:office:office" xmlns:r="http://schemas.openxmlformats.org/officeDocument/2006/relationships" xmlns:m="http://schemas.openxmlformats.org/officeDocument/2006/math" xmlns:v="urn:schemas-microsoft-com:vml" xmlns:wp14="http://schemas.microsoft.com/office/word/2010/wordprocessingDrawing" xmlns:wp="http://schemas.openxmlformats.org/drawingml/2006/wordprocessingDrawing" xmlns:w10="urn:schemas-microsoft-com:office:word" xmlns:w="http://schemas.openxmlformats.org/wordprocessingml/2006/main" xmlns:w14="http://schemas.microsoft.com/office/word/2010/wordml" xmlns:w15="http://schemas.microsoft.com/office/word/2012/wordml" xmlns:w16cex="http://schemas.microsoft.com/office/word/2018/wordml/cex" xmlns:w16cid="http://schemas.microsoft.com/office/word/2016/wordml/cid" xmlns:w16="http://schemas.microsoft.com/office/word/2018/wordml" xmlns:w16se="http://schemas.microsoft.com/office/word/2015/wordml/symex" xmlns:wpg="http://schemas.microsoft.com/office/word/2010/wordprocessingGroup" xmlns:wpi="http://schemas.microsoft.com/office/word/2010/wordprocessingInk" xmlns:wne="http://schemas.microsoft.com/office/word/2006/wordml" xmlns:wps="http://schemas.microsoft.com/office/word/2010/wordprocessingShape" mc:Ignorable="w14 w15 w16se w16cid w16 w16cex wp14">
+<w:ftr xmlns:wpc="http://schemas.microsoft.com/office/word/2010/wordprocessingCanvas" xmlns:cx="http://schemas.microsoft.com/office/drawing/2014/chartex" xmlns:cx1="http://schemas.microsoft.com/office/drawing/2015/9/8/chartex" xmlns:cx2="http://schemas.microsoft.com/office/drawing/2015/10/21/chartex" xmlns:cx3="http://schemas.microsoft.com/office/drawing/2016/5/9/chartex" xmlns:cx4="http://schemas.microsoft.com/office/drawing/2016/5/10/chartex" xmlns:cx5="http://schemas.microsoft.com/office/drawing/2016/5/11/chartex" xmlns:cx6="http://schemas.microsoft.com/office/drawing/2016/5/12/chartex" xmlns:cx7="http://schemas.microsoft.com/office/drawing/2016/5/13/chartex" xmlns:cx8="http://schemas.microsoft.com/office/drawing/2016/5/14/chartex" xmlns:mc="http://schemas.openxmlformats.org/markup-compatibility/2006" xmlns:aink="http://schemas.microsoft.com/office/drawing/2016/ink" xmlns:am3d="http://schemas.microsoft.com/office/drawing/2017/model3d" xmlns:o="urn:schemas-microsoft-com:office:office" xmlns:oel="http://schemas.microsoft.com/office/2019/extlst" xmlns:r="http://schemas.openxmlformats.org/officeDocument/2006/relationships" xmlns:m="http://schemas.openxmlformats.org/officeDocument/2006/math" xmlns:v="urn:schemas-microsoft-com:vml" xmlns:wp14="http://schemas.microsoft.com/office/word/2010/wordprocessingDrawing" xmlns:wp="http://schemas.openxmlformats.org/drawingml/2006/wordprocessingDrawing" xmlns:w10="urn:schemas-microsoft-com:office:word" xmlns:w="http://schemas.openxmlformats.org/wordprocessingml/2006/main" xmlns:w14="http://schemas.microsoft.com/office/word/2010/wordml" xmlns:w15="http://schemas.microsoft.com/office/word/2012/wordml" xmlns:w16cex="http://schemas.microsoft.com/office/word/2018/wordml/cex" xmlns:w16cid="http://schemas.microsoft.com/office/word/2016/wordml/cid" xmlns:w16="http://schemas.microsoft.com/office/word/2018/wordml" xmlns:w16du="http://schemas.microsoft.com/office/word/2023/wordml/word16du" xmlns:w16sdtdh="http://schemas.microsoft.com/office/word/2020/wordml/sdtdatahash" xmlns:w16sdtfl="http://schemas.microsoft.com/office/word/2024/wordml/sdtformatlock" xmlns:w16se="http://schemas.microsoft.com/office/word/2015/wordml/symex" xmlns:wpg="http://schemas.microsoft.com/office/word/2010/wordprocessingGroup" xmlns:wpi="http://schemas.microsoft.com/office/word/2010/wordprocessingInk" xmlns:wne="http://schemas.microsoft.com/office/word/2006/wordml" xmlns:wps="http://schemas.microsoft.com/office/word/2010/wordprocessingShape" mc:Ignorable="w14 w15 w16se w16cid w16 w16cex w16sdtdh w16sdtfl w16du wp14">
   <w:sdt>
     <w:sdtPr>
       <w:id w:val="-423428194"/>
@@ -9540,7 +9244,7 @@
 </file>
 
 <file path=word/footnotes.xml><?xml version="1.0" encoding="utf-8"?>
-<w:footnotes xmlns:wpc="http://schemas.microsoft.com/office/word/2010/wordprocessingCanvas" xmlns:cx="http://schemas.microsoft.com/office/drawing/2014/chartex" xmlns:cx1="http://schemas.microsoft.com/office/drawing/2015/9/8/chartex" xmlns:cx2="http://schemas.microsoft.com/office/drawing/2015/10/21/chartex" xmlns:cx3="http://schemas.microsoft.com/office/drawing/2016/5/9/chartex" xmlns:cx4="http://schemas.microsoft.com/office/drawing/2016/5/10/chartex" xmlns:cx5="http://schemas.microsoft.com/office/drawing/2016/5/11/chartex" xmlns:cx6="http://schemas.microsoft.com/office/drawing/2016/5/12/chartex" xmlns:cx7="http://schemas.microsoft.com/office/drawing/2016/5/13/chartex" xmlns:cx8="http://schemas.microsoft.com/office/drawing/2016/5/14/chartex" xmlns:mc="http://schemas.openxmlformats.org/markup-compatibility/2006" xmlns:aink="http://schemas.microsoft.com/office/drawing/2016/ink" xmlns:am3d="http://schemas.microsoft.com/office/drawing/2017/model3d" xmlns:o="urn:schemas-microsoft-com:office:office" xmlns:r="http://schemas.openxmlformats.org/officeDocument/2006/relationships" xmlns:m="http://schemas.openxmlformats.org/officeDocument/2006/math" xmlns:v="urn:schemas-microsoft-com:vml" xmlns:wp14="http://schemas.microsoft.com/office/word/2010/wordprocessingDrawing" xmlns:wp="http://schemas.openxmlformats.org/drawingml/2006/wordprocessingDrawing" xmlns:w10="urn:schemas-microsoft-com:office:word" xmlns:w="http://schemas.openxmlformats.org/wordprocessingml/2006/main" xmlns:w14="http://schemas.microsoft.com/office/word/2010/wordml" xmlns:w15="http://schemas.microsoft.com/office/word/2012/wordml" xmlns:w16cex="http://schemas.microsoft.com/office/word/2018/wordml/cex" xmlns:w16cid="http://schemas.microsoft.com/office/word/2016/wordml/cid" xmlns:w16="http://schemas.microsoft.com/office/word/2018/wordml" xmlns:w16se="http://schemas.microsoft.com/office/word/2015/wordml/symex" xmlns:wpg="http://schemas.microsoft.com/office/word/2010/wordprocessingGroup" xmlns:wpi="http://schemas.microsoft.com/office/word/2010/wordprocessingInk" xmlns:wne="http://schemas.microsoft.com/office/word/2006/wordml" xmlns:wps="http://schemas.microsoft.com/office/word/2010/wordprocessingShape" mc:Ignorable="w14 w15 w16se w16cid w16 w16cex wp14">
+<w:footnotes xmlns:wpc="http://schemas.microsoft.com/office/word/2010/wordprocessingCanvas" xmlns:cx="http://schemas.microsoft.com/office/drawing/2014/chartex" xmlns:cx1="http://schemas.microsoft.com/office/drawing/2015/9/8/chartex" xmlns:cx2="http://schemas.microsoft.com/office/drawing/2015/10/21/chartex" xmlns:cx3="http://schemas.microsoft.com/office/drawing/2016/5/9/chartex" xmlns:cx4="http://schemas.microsoft.com/office/drawing/2016/5/10/chartex" xmlns:cx5="http://schemas.microsoft.com/office/drawing/2016/5/11/chartex" xmlns:cx6="http://schemas.microsoft.com/office/drawing/2016/5/12/chartex" xmlns:cx7="http://schemas.microsoft.com/office/drawing/2016/5/13/chartex" xmlns:cx8="http://schemas.microsoft.com/office/drawing/2016/5/14/chartex" xmlns:mc="http://schemas.openxmlformats.org/markup-compatibility/2006" xmlns:aink="http://schemas.microsoft.com/office/drawing/2016/ink" xmlns:am3d="http://schemas.microsoft.com/office/drawing/2017/model3d" xmlns:o="urn:schemas-microsoft-com:office:office" xmlns:oel="http://schemas.microsoft.com/office/2019/extlst" xmlns:r="http://schemas.openxmlformats.org/officeDocument/2006/relationships" xmlns:m="http://schemas.openxmlformats.org/officeDocument/2006/math" xmlns:v="urn:schemas-microsoft-com:vml" xmlns:wp14="http://schemas.microsoft.com/office/word/2010/wordprocessingDrawing" xmlns:wp="http://schemas.openxmlformats.org/drawingml/2006/wordprocessingDrawing" xmlns:w10="urn:schemas-microsoft-com:office:word" xmlns:w="http://schemas.openxmlformats.org/wordprocessingml/2006/main" xmlns:w14="http://schemas.microsoft.com/office/word/2010/wordml" xmlns:w15="http://schemas.microsoft.com/office/word/2012/wordml" xmlns:w16cex="http://schemas.microsoft.com/office/word/2018/wordml/cex" xmlns:w16cid="http://schemas.microsoft.com/office/word/2016/wordml/cid" xmlns:w16="http://schemas.microsoft.com/office/word/2018/wordml" xmlns:w16du="http://schemas.microsoft.com/office/word/2023/wordml/word16du" xmlns:w16sdtdh="http://schemas.microsoft.com/office/word/2020/wordml/sdtdatahash" xmlns:w16sdtfl="http://schemas.microsoft.com/office/word/2024/wordml/sdtformatlock" xmlns:w16se="http://schemas.microsoft.com/office/word/2015/wordml/symex" xmlns:wpg="http://schemas.microsoft.com/office/word/2010/wordprocessingGroup" xmlns:wpi="http://schemas.microsoft.com/office/word/2010/wordprocessingInk" xmlns:wne="http://schemas.microsoft.com/office/word/2006/wordml" xmlns:wps="http://schemas.microsoft.com/office/word/2010/wordprocessingShape" mc:Ignorable="w14 w15 w16se w16cid w16 w16cex w16sdtdh w16sdtfl w16du wp14">
   <w:footnote w:type="separator" w:id="-1">
     <w:p>
       <w:pPr>
@@ -9565,7 +9269,7 @@
 </file>
 
 <file path=word/numbering.xml><?xml version="1.0" encoding="utf-8"?>
-<w:numbering xmlns:wpc="http://schemas.microsoft.com/office/word/2010/wordprocessingCanvas" xmlns:cx="http://schemas.microsoft.com/office/drawing/2014/chartex" xmlns:cx1="http://schemas.microsoft.com/office/drawing/2015/9/8/chartex" xmlns:cx2="http://schemas.microsoft.com/office/drawing/2015/10/21/chartex" xmlns:cx3="http://schemas.microsoft.com/office/drawing/2016/5/9/chartex" xmlns:cx4="http://schemas.microsoft.com/office/drawing/2016/5/10/chartex" xmlns:cx5="http://schemas.microsoft.com/office/drawing/2016/5/11/chartex" xmlns:cx6="http://schemas.microsoft.com/office/drawing/2016/5/12/chartex" xmlns:cx7="http://schemas.microsoft.com/office/drawing/2016/5/13/chartex" xmlns:cx8="http://schemas.microsoft.com/office/drawing/2016/5/14/chartex" xmlns:mc="http://schemas.openxmlformats.org/markup-compatibility/2006" xmlns:aink="http://schemas.microsoft.com/office/drawing/2016/ink" xmlns:am3d="http://schemas.microsoft.com/office/drawing/2017/model3d" xmlns:o="urn:schemas-microsoft-com:office:office" xmlns:r="http://schemas.openxmlformats.org/officeDocument/2006/relationships" xmlns:m="http://schemas.openxmlformats.org/officeDocument/2006/math" xmlns:v="urn:schemas-microsoft-com:vml" xmlns:wp14="http://schemas.microsoft.com/office/word/2010/wordprocessingDrawing" xmlns:wp="http://schemas.openxmlformats.org/drawingml/2006/wordprocessingDrawing" xmlns:w10="urn:schemas-microsoft-com:office:word" xmlns:w="http://schemas.openxmlformats.org/wordprocessingml/2006/main" xmlns:w14="http://schemas.microsoft.com/office/word/2010/wordml" xmlns:w15="http://schemas.microsoft.com/office/word/2012/wordml" xmlns:w16cex="http://schemas.microsoft.com/office/word/2018/wordml/cex" xmlns:w16cid="http://schemas.microsoft.com/office/word/2016/wordml/cid" xmlns:w16="http://schemas.microsoft.com/office/word/2018/wordml" xmlns:w16se="http://schemas.microsoft.com/office/word/2015/wordml/symex" xmlns:wpg="http://schemas.microsoft.com/office/word/2010/wordprocessingGroup" xmlns:wpi="http://schemas.microsoft.com/office/word/2010/wordprocessingInk" xmlns:wne="http://schemas.microsoft.com/office/word/2006/wordml" xmlns:wps="http://schemas.microsoft.com/office/word/2010/wordprocessingShape" mc:Ignorable="w14 w15 w16se w16cid w16 w16cex wp14">
+<w:numbering xmlns:wpc="http://schemas.microsoft.com/office/word/2010/wordprocessingCanvas" xmlns:cx="http://schemas.microsoft.com/office/drawing/2014/chartex" xmlns:cx1="http://schemas.microsoft.com/office/drawing/2015/9/8/chartex" xmlns:cx2="http://schemas.microsoft.com/office/drawing/2015/10/21/chartex" xmlns:cx3="http://schemas.microsoft.com/office/drawing/2016/5/9/chartex" xmlns:cx4="http://schemas.microsoft.com/office/drawing/2016/5/10/chartex" xmlns:cx5="http://schemas.microsoft.com/office/drawing/2016/5/11/chartex" xmlns:cx6="http://schemas.microsoft.com/office/drawing/2016/5/12/chartex" xmlns:cx7="http://schemas.microsoft.com/office/drawing/2016/5/13/chartex" xmlns:cx8="http://schemas.microsoft.com/office/drawing/2016/5/14/chartex" xmlns:mc="http://schemas.openxmlformats.org/markup-compatibility/2006" xmlns:aink="http://schemas.microsoft.com/office/drawing/2016/ink" xmlns:am3d="http://schemas.microsoft.com/office/drawing/2017/model3d" xmlns:o="urn:schemas-microsoft-com:office:office" xmlns:oel="http://schemas.microsoft.com/office/2019/extlst" xmlns:r="http://schemas.openxmlformats.org/officeDocument/2006/relationships" xmlns:m="http://schemas.openxmlformats.org/officeDocument/2006/math" xmlns:v="urn:schemas-microsoft-com:vml" xmlns:wp14="http://schemas.microsoft.com/office/word/2010/wordprocessingDrawing" xmlns:wp="http://schemas.openxmlformats.org/drawingml/2006/wordprocessingDrawing" xmlns:w10="urn:schemas-microsoft-com:office:word" xmlns:w="http://schemas.openxmlformats.org/wordprocessingml/2006/main" xmlns:w14="http://schemas.microsoft.com/office/word/2010/wordml" xmlns:w15="http://schemas.microsoft.com/office/word/2012/wordml" xmlns:w16cex="http://schemas.microsoft.com/office/word/2018/wordml/cex" xmlns:w16cid="http://schemas.microsoft.com/office/word/2016/wordml/cid" xmlns:w16="http://schemas.microsoft.com/office/word/2018/wordml" xmlns:w16du="http://schemas.microsoft.com/office/word/2023/wordml/word16du" xmlns:w16sdtdh="http://schemas.microsoft.com/office/word/2020/wordml/sdtdatahash" xmlns:w16sdtfl="http://schemas.microsoft.com/office/word/2024/wordml/sdtformatlock" xmlns:w16se="http://schemas.microsoft.com/office/word/2015/wordml/symex" xmlns:wpg="http://schemas.microsoft.com/office/word/2010/wordprocessingGroup" xmlns:wpi="http://schemas.microsoft.com/office/word/2010/wordprocessingInk" xmlns:wne="http://schemas.microsoft.com/office/word/2006/wordml" xmlns:wps="http://schemas.microsoft.com/office/word/2010/wordprocessingShape" mc:Ignorable="w14 w15 w16se w16cid w16 w16cex w16sdtdh w16sdtfl w16du wp14">
   <w:abstractNum w:abstractNumId="0" w15:restartNumberingAfterBreak="0">
     <w:nsid w:val="0040471B"/>
     <w:multiLevelType w:val="hybridMultilevel"/>
@@ -12144,89 +11848,89 @@
       </w:pPr>
     </w:lvl>
   </w:abstractNum>
-  <w:num w:numId="1">
+  <w:num w:numId="1" w16cid:durableId="1779064401">
     <w:abstractNumId w:val="17"/>
   </w:num>
-  <w:num w:numId="2">
+  <w:num w:numId="2" w16cid:durableId="1154030377">
     <w:abstractNumId w:val="9"/>
   </w:num>
-  <w:num w:numId="3">
+  <w:num w:numId="3" w16cid:durableId="1385832896">
     <w:abstractNumId w:val="23"/>
   </w:num>
-  <w:num w:numId="4">
+  <w:num w:numId="4" w16cid:durableId="1457484493">
     <w:abstractNumId w:val="0"/>
   </w:num>
-  <w:num w:numId="5">
+  <w:num w:numId="5" w16cid:durableId="1317495233">
     <w:abstractNumId w:val="11"/>
   </w:num>
-  <w:num w:numId="6">
+  <w:num w:numId="6" w16cid:durableId="1789856713">
     <w:abstractNumId w:val="5"/>
   </w:num>
-  <w:num w:numId="7">
+  <w:num w:numId="7" w16cid:durableId="707415807">
     <w:abstractNumId w:val="4"/>
   </w:num>
-  <w:num w:numId="8">
+  <w:num w:numId="8" w16cid:durableId="71045990">
     <w:abstractNumId w:val="3"/>
   </w:num>
-  <w:num w:numId="9">
+  <w:num w:numId="9" w16cid:durableId="1698388563">
     <w:abstractNumId w:val="25"/>
   </w:num>
-  <w:num w:numId="10">
+  <w:num w:numId="10" w16cid:durableId="1625889503">
     <w:abstractNumId w:val="7"/>
   </w:num>
-  <w:num w:numId="11">
+  <w:num w:numId="11" w16cid:durableId="1306274285">
     <w:abstractNumId w:val="22"/>
   </w:num>
-  <w:num w:numId="12">
+  <w:num w:numId="12" w16cid:durableId="327487731">
     <w:abstractNumId w:val="21"/>
   </w:num>
-  <w:num w:numId="13">
+  <w:num w:numId="13" w16cid:durableId="492450044">
     <w:abstractNumId w:val="2"/>
   </w:num>
-  <w:num w:numId="14">
+  <w:num w:numId="14" w16cid:durableId="1507016815">
     <w:abstractNumId w:val="8"/>
   </w:num>
-  <w:num w:numId="15">
+  <w:num w:numId="15" w16cid:durableId="1139298172">
     <w:abstractNumId w:val="24"/>
   </w:num>
-  <w:num w:numId="16">
+  <w:num w:numId="16" w16cid:durableId="519247397">
     <w:abstractNumId w:val="12"/>
   </w:num>
-  <w:num w:numId="17">
+  <w:num w:numId="17" w16cid:durableId="851148080">
     <w:abstractNumId w:val="13"/>
   </w:num>
-  <w:num w:numId="18">
+  <w:num w:numId="18" w16cid:durableId="2043244433">
     <w:abstractNumId w:val="20"/>
   </w:num>
-  <w:num w:numId="19">
+  <w:num w:numId="19" w16cid:durableId="1563977680">
     <w:abstractNumId w:val="14"/>
   </w:num>
-  <w:num w:numId="20">
+  <w:num w:numId="20" w16cid:durableId="904221507">
     <w:abstractNumId w:val="6"/>
   </w:num>
-  <w:num w:numId="21">
+  <w:num w:numId="21" w16cid:durableId="884291925">
     <w:abstractNumId w:val="18"/>
   </w:num>
-  <w:num w:numId="22">
+  <w:num w:numId="22" w16cid:durableId="879243650">
     <w:abstractNumId w:val="16"/>
   </w:num>
-  <w:num w:numId="23">
+  <w:num w:numId="23" w16cid:durableId="2075422363">
     <w:abstractNumId w:val="19"/>
   </w:num>
-  <w:num w:numId="24">
+  <w:num w:numId="24" w16cid:durableId="770322500">
     <w:abstractNumId w:val="10"/>
   </w:num>
-  <w:num w:numId="25">
+  <w:num w:numId="25" w16cid:durableId="158810727">
     <w:abstractNumId w:val="15"/>
   </w:num>
-  <w:num w:numId="26">
+  <w:num w:numId="26" w16cid:durableId="2074696156">
     <w:abstractNumId w:val="1"/>
   </w:num>
 </w:numbering>
 </file>
 
 <file path=word/styles.xml><?xml version="1.0" encoding="utf-8"?>
-<w:styles xmlns:mc="http://schemas.openxmlformats.org/markup-compatibility/2006" xmlns:r="http://schemas.openxmlformats.org/officeDocument/2006/relationships" xmlns:w="http://schemas.openxmlformats.org/wordprocessingml/2006/main" xmlns:w14="http://schemas.microsoft.com/office/word/2010/wordml" xmlns:w15="http://schemas.microsoft.com/office/word/2012/wordml" xmlns:w16cex="http://schemas.microsoft.com/office/word/2018/wordml/cex" xmlns:w16cid="http://schemas.microsoft.com/office/word/2016/wordml/cid" xmlns:w16="http://schemas.microsoft.com/office/word/2018/wordml" xmlns:w16se="http://schemas.microsoft.com/office/word/2015/wordml/symex" mc:Ignorable="w14 w15 w16se w16cid w16 w16cex">
+<w:styles xmlns:mc="http://schemas.openxmlformats.org/markup-compatibility/2006" xmlns:r="http://schemas.openxmlformats.org/officeDocument/2006/relationships" xmlns:w="http://schemas.openxmlformats.org/wordprocessingml/2006/main" xmlns:w14="http://schemas.microsoft.com/office/word/2010/wordml" xmlns:w15="http://schemas.microsoft.com/office/word/2012/wordml" xmlns:w16cex="http://schemas.microsoft.com/office/word/2018/wordml/cex" xmlns:w16cid="http://schemas.microsoft.com/office/word/2016/wordml/cid" xmlns:w16="http://schemas.microsoft.com/office/word/2018/wordml" xmlns:w16du="http://schemas.microsoft.com/office/word/2023/wordml/word16du" xmlns:w16sdtdh="http://schemas.microsoft.com/office/word/2020/wordml/sdtdatahash" xmlns:w16sdtfl="http://schemas.microsoft.com/office/word/2024/wordml/sdtformatlock" xmlns:w16se="http://schemas.microsoft.com/office/word/2015/wordml/symex" mc:Ignorable="w14 w15 w16se w16cid w16 w16cex w16sdtdh w16sdtfl w16du">
   <w:docDefaults>
     <w:rPrDefault>
       <w:rPr>

</xml_diff>